<commit_message>
Add: Models of structure, and extruct docx file to the models, and fix the path the file to the Bytes
</commit_message>
<xml_diff>
--- a/data/inputs/5 Things to Do Every Day to Be Happy.docx
+++ b/data/inputs/5 Things to Do Every Day to Be Happy.docx
@@ -1,19 +1,14 @@
 
 <file path=word/document.xml><?xml version="1.0" encoding="utf-8"?>
-<w:document xmlns:wpc="http://schemas.microsoft.com/office/word/2010/wordprocessingCanvas" xmlns:cx="http://schemas.microsoft.com/office/drawing/2014/chartex" xmlns:cx1="http://schemas.microsoft.com/office/drawing/2015/9/8/chartex" xmlns:cx2="http://schemas.microsoft.com/office/drawing/2015/10/21/chartex" xmlns:cx3="http://schemas.microsoft.com/office/drawing/2016/5/9/chartex" xmlns:cx4="http://schemas.microsoft.com/office/drawing/2016/5/10/chartex" xmlns:cx5="http://schemas.microsoft.com/office/drawing/2016/5/11/chartex" xmlns:cx6="http://schemas.microsoft.com/office/drawing/2016/5/12/chartex" xmlns:cx7="http://schemas.microsoft.com/office/drawing/2016/5/13/chartex" xmlns:cx8="http://schemas.microsoft.com/office/drawing/2016/5/14/chartex" xmlns:mc="http://schemas.openxmlformats.org/markup-compatibility/2006" xmlns:aink="http://schemas.microsoft.com/office/drawing/2016/ink" xmlns:am3d="http://schemas.microsoft.com/office/drawing/2017/model3d" xmlns:o="urn:schemas-microsoft-com:office:office" xmlns:oel="http://schemas.microsoft.com/office/2019/extlst" xmlns:r="http://schemas.openxmlformats.org/officeDocument/2006/relationships" xmlns:m="http://schemas.openxmlformats.org/officeDocument/2006/math" xmlns:v="urn:schemas-microsoft-com:vml" xmlns:wp14="http://schemas.microsoft.com/office/word/2010/wordprocessingDrawing" xmlns:wp="http://schemas.openxmlformats.org/drawingml/2006/wordprocessingDrawing" xmlns:w10="urn:schemas-microsoft-com:office:word" xmlns:w="http://schemas.openxmlformats.org/wordprocessingml/2006/main" xmlns:w14="http://schemas.microsoft.com/office/word/2010/wordml" xmlns:w15="http://schemas.microsoft.com/office/word/2012/wordml" xmlns:w16cex="http://schemas.microsoft.com/office/word/2018/wordml/cex" xmlns:w16cid="http://schemas.microsoft.com/office/word/2016/wordml/cid" xmlns:w16="http://schemas.microsoft.com/office/word/2018/wordml" xmlns:w16sdtdh="http://schemas.microsoft.com/office/word/2020/wordml/sdtdatahash" xmlns:w16se="http://schemas.microsoft.com/office/word/2015/wordml/symex" xmlns:wpg="http://schemas.microsoft.com/office/word/2010/wordprocessingGroup" xmlns:wpi="http://schemas.microsoft.com/office/word/2010/wordprocessingInk" xmlns:wne="http://schemas.microsoft.com/office/word/2006/wordml" xmlns:wps="http://schemas.microsoft.com/office/word/2010/wordprocessingShape" mc:Ignorable="w14 w15 w16se w16cid w16 w16cex w16sdtdh wp14">
+<w:document xmlns:wpc="http://schemas.microsoft.com/office/word/2010/wordprocessingCanvas" xmlns:cx="http://schemas.microsoft.com/office/drawing/2014/chartex" xmlns:cx1="http://schemas.microsoft.com/office/drawing/2015/9/8/chartex" xmlns:cx2="http://schemas.microsoft.com/office/drawing/2015/10/21/chartex" xmlns:cx3="http://schemas.microsoft.com/office/drawing/2016/5/9/chartex" xmlns:cx4="http://schemas.microsoft.com/office/drawing/2016/5/10/chartex" xmlns:cx5="http://schemas.microsoft.com/office/drawing/2016/5/11/chartex" xmlns:cx6="http://schemas.microsoft.com/office/drawing/2016/5/12/chartex" xmlns:cx7="http://schemas.microsoft.com/office/drawing/2016/5/13/chartex" xmlns:cx8="http://schemas.microsoft.com/office/drawing/2016/5/14/chartex" xmlns:mc="http://schemas.openxmlformats.org/markup-compatibility/2006" xmlns:aink="http://schemas.microsoft.com/office/drawing/2016/ink" xmlns:am3d="http://schemas.microsoft.com/office/drawing/2017/model3d" xmlns:o="urn:schemas-microsoft-com:office:office" xmlns:oel="http://schemas.microsoft.com/office/2019/extlst" xmlns:r="http://schemas.openxmlformats.org/officeDocument/2006/relationships" xmlns:m="http://schemas.openxmlformats.org/officeDocument/2006/math" xmlns:v="urn:schemas-microsoft-com:vml" xmlns:wp14="http://schemas.microsoft.com/office/word/2010/wordprocessingDrawing" xmlns:wp="http://schemas.openxmlformats.org/drawingml/2006/wordprocessingDrawing" xmlns:w10="urn:schemas-microsoft-com:office:word" xmlns:w="http://schemas.openxmlformats.org/wordprocessingml/2006/main" xmlns:w14="http://schemas.microsoft.com/office/word/2010/wordml" xmlns:w15="http://schemas.microsoft.com/office/word/2012/wordml" xmlns:w16cex="http://schemas.microsoft.com/office/word/2018/wordml/cex" xmlns:w16cid="http://schemas.microsoft.com/office/word/2016/wordml/cid" xmlns:w16="http://schemas.microsoft.com/office/word/2018/wordml" xmlns:w16du="http://schemas.microsoft.com/office/word/2023/wordml/word16du" xmlns:w16sdtdh="http://schemas.microsoft.com/office/word/2020/wordml/sdtdatahash" xmlns:w16sdtfl="http://schemas.microsoft.com/office/word/2024/wordml/sdtformatlock" xmlns:w16se="http://schemas.microsoft.com/office/word/2015/wordml/symex" xmlns:wpg="http://schemas.microsoft.com/office/word/2010/wordprocessingGroup" xmlns:wpi="http://schemas.microsoft.com/office/word/2010/wordprocessingInk" xmlns:wne="http://schemas.microsoft.com/office/word/2006/wordml" xmlns:wps="http://schemas.microsoft.com/office/word/2010/wordprocessingShape" mc:Ignorable="w14 w15 w16se w16cid w16 w16cex w16sdtdh w16sdtfl w16du wp14">
   <w:body>
     <w:p>
-      <w:pPr>
-        <w:rPr>
-          <w:lang w:val="en-IL"/>
-        </w:rPr>
-      </w:pPr>
-      <w:r>
-        <w:rPr>
-          <w:lang w:val="en-IL"/>
-        </w:rPr>
-        <w:pict w14:anchorId="6812173B">
-          <v:rect id="_x0000_i1079" style="width:0;height:1.5pt" o:hralign="center" o:hrstd="t" o:hr="t" fillcolor="#a0a0a0" stroked="f"/>
+      <w:r>
+        <w:rPr>
+          <w:noProof/>
+        </w:rPr>
+        <w:pict w14:anchorId="3E602670">
+          <v:rect id="_x0000_i1032" alt="" style="width:415.3pt;height:.05pt;mso-width-percent:0;mso-height-percent:0;mso-width-percent:0;mso-height-percent:0" o:hralign="center" o:hrstd="t" o:hr="t" fillcolor="#a0a0a0" stroked="f"/>
         </w:pict>
       </w:r>
     </w:p>
@@ -22,70 +17,43 @@
         <w:rPr>
           <w:b/>
           <w:bCs/>
-          <w:lang w:val="en-IL"/>
-        </w:rPr>
-      </w:pPr>
-      <w:r>
-        <w:rPr>
-          <w:b/>
-          <w:bCs/>
-          <w:lang w:val="en-IL"/>
+        </w:rPr>
+      </w:pPr>
+      <w:r>
+        <w:rPr>
+          <w:b/>
+          <w:bCs/>
         </w:rPr>
         <w:t>5 Things to Do Every Day to Be Happy</w:t>
       </w:r>
     </w:p>
     <w:p>
-      <w:pPr>
-        <w:rPr>
-          <w:lang w:val="en-IL"/>
-        </w:rPr>
-      </w:pPr>
-      <w:r>
-        <w:rPr>
-          <w:lang w:val="en-IL"/>
-        </w:rPr>
+      <w:r>
         <w:t>Happiness isn’t an accident, and it isn’t a personality trait you either have or don’t. It’s a daily practice—built from small, repeatable actions that shape your mindset, energy, and emotional stability. In a world full of pressure, speed, and uncertainty, the people who stay grounded and joyful don’t necessarily have easier lives; they simply manage their days differently.</w:t>
       </w:r>
     </w:p>
     <w:p>
-      <w:pPr>
-        <w:rPr>
-          <w:lang w:val="en-IL"/>
-        </w:rPr>
-      </w:pPr>
-      <w:r>
-        <w:rPr>
-          <w:lang w:val="en-IL"/>
-        </w:rPr>
+      <w:r>
         <w:t xml:space="preserve">Here are </w:t>
       </w:r>
       <w:r>
         <w:rPr>
           <w:b/>
           <w:bCs/>
-          <w:lang w:val="en-IL"/>
         </w:rPr>
         <w:t>five simple but powerful habits you can do every single day</w:t>
       </w:r>
       <w:r>
-        <w:rPr>
-          <w:lang w:val="en-IL"/>
-        </w:rPr>
         <w:t xml:space="preserve"> to create more happiness, clarity, and emotional strength.</w:t>
       </w:r>
     </w:p>
     <w:p>
-      <w:pPr>
-        <w:rPr>
-          <w:lang w:val="en-IL"/>
-        </w:rPr>
-      </w:pPr>
-      <w:r>
-        <w:rPr>
-          <w:lang w:val="en-IL"/>
-        </w:rPr>
-        <w:pict w14:anchorId="19121378">
-          <v:rect id="_x0000_i1080" style="width:0;height:1.5pt" o:hralign="center" o:hrstd="t" o:hr="t" fillcolor="#a0a0a0" stroked="f"/>
+      <w:r>
+        <w:rPr>
+          <w:noProof/>
+        </w:rPr>
+        <w:pict w14:anchorId="70EBA7F3">
+          <v:rect id="_x0000_i1031" alt="" style="width:415.3pt;height:.05pt;mso-width-percent:0;mso-height-percent:0;mso-width-percent:0;mso-height-percent:0" o:hralign="center" o:hrstd="t" o:hr="t" fillcolor="#a0a0a0" stroked="f"/>
         </w:pict>
       </w:r>
     </w:p>
@@ -94,55 +62,33 @@
         <w:rPr>
           <w:b/>
           <w:bCs/>
-          <w:lang w:val="en-IL"/>
-        </w:rPr>
-      </w:pPr>
-      <w:r>
-        <w:rPr>
-          <w:b/>
-          <w:bCs/>
-          <w:lang w:val="en-IL"/>
+        </w:rPr>
+      </w:pPr>
+      <w:r>
+        <w:rPr>
+          <w:b/>
+          <w:bCs/>
         </w:rPr>
         <w:t>1. Start with One Empowering Moment of Control</w:t>
       </w:r>
     </w:p>
     <w:p>
-      <w:pPr>
-        <w:rPr>
-          <w:lang w:val="en-IL"/>
-        </w:rPr>
-      </w:pPr>
-      <w:r>
-        <w:rPr>
-          <w:lang w:val="en-IL"/>
-        </w:rPr>
+      <w:r>
         <w:t>Your morning sets the tone for everything. Most people wake up and immediately react—scrolling their phone, answering messages, or rushing into tasks. This creates anxiety before the day even begins.</w:t>
       </w:r>
     </w:p>
     <w:p>
-      <w:pPr>
-        <w:rPr>
-          <w:lang w:val="en-IL"/>
-        </w:rPr>
-      </w:pPr>
-      <w:r>
-        <w:rPr>
-          <w:lang w:val="en-IL"/>
-        </w:rPr>
+      <w:r>
         <w:t xml:space="preserve">Instead, give yourself </w:t>
       </w:r>
       <w:r>
         <w:rPr>
           <w:b/>
           <w:bCs/>
-          <w:lang w:val="en-IL"/>
         </w:rPr>
         <w:t>90 seconds of deliberate control</w:t>
       </w:r>
       <w:r>
-        <w:rPr>
-          <w:lang w:val="en-IL"/>
-        </w:rPr>
         <w:t xml:space="preserve"> when you wake up. It can be something tiny:</w:t>
       </w:r>
     </w:p>
@@ -152,14 +98,8 @@
           <w:ilvl w:val="0"/>
           <w:numId w:val="1"/>
         </w:numPr>
-        <w:rPr>
-          <w:lang w:val="en-IL"/>
-        </w:rPr>
-      </w:pPr>
-      <w:r>
-        <w:rPr>
-          <w:lang w:val="en-IL"/>
-        </w:rPr>
+      </w:pPr>
+      <w:r>
         <w:t>Drink a glass of water mindfully</w:t>
       </w:r>
     </w:p>
@@ -169,14 +109,8 @@
           <w:ilvl w:val="0"/>
           <w:numId w:val="1"/>
         </w:numPr>
-        <w:rPr>
-          <w:lang w:val="en-IL"/>
-        </w:rPr>
-      </w:pPr>
-      <w:r>
-        <w:rPr>
-          <w:lang w:val="en-IL"/>
-        </w:rPr>
+      </w:pPr>
+      <w:r>
         <w:t>Open a window and breathe fresh air</w:t>
       </w:r>
     </w:p>
@@ -186,14 +120,8 @@
           <w:ilvl w:val="0"/>
           <w:numId w:val="1"/>
         </w:numPr>
-        <w:rPr>
-          <w:lang w:val="en-IL"/>
-        </w:rPr>
-      </w:pPr>
-      <w:r>
-        <w:rPr>
-          <w:lang w:val="en-IL"/>
-        </w:rPr>
+      </w:pPr>
+      <w:r>
         <w:t>Stretch your arms and back</w:t>
       </w:r>
     </w:p>
@@ -203,14 +131,8 @@
           <w:ilvl w:val="0"/>
           <w:numId w:val="1"/>
         </w:numPr>
-        <w:rPr>
-          <w:lang w:val="en-IL"/>
-        </w:rPr>
-      </w:pPr>
-      <w:r>
-        <w:rPr>
-          <w:lang w:val="en-IL"/>
-        </w:rPr>
+      </w:pPr>
+      <w:r>
         <w:t>Set one intention for the day</w:t>
       </w:r>
     </w:p>
@@ -220,104 +142,50 @@
           <w:ilvl w:val="0"/>
           <w:numId w:val="1"/>
         </w:numPr>
-        <w:rPr>
-          <w:lang w:val="en-IL"/>
-        </w:rPr>
-      </w:pPr>
-      <w:r>
-        <w:rPr>
-          <w:lang w:val="en-IL"/>
-        </w:rPr>
+      </w:pPr>
+      <w:r>
         <w:t>Think of one thing you’re grateful for</w:t>
       </w:r>
     </w:p>
     <w:p>
-      <w:pPr>
-        <w:rPr>
-          <w:lang w:val="en-IL"/>
-        </w:rPr>
-      </w:pPr>
-      <w:r>
-        <w:rPr>
-          <w:lang w:val="en-IL"/>
-        </w:rPr>
-        <w:t>These micro-</w:t>
-      </w:r>
-      <w:proofErr w:type="spellStart"/>
-      <w:r>
-        <w:rPr>
-          <w:lang w:val="en-IL"/>
-        </w:rPr>
-        <w:t>behaviors</w:t>
-      </w:r>
-      <w:proofErr w:type="spellEnd"/>
-      <w:r>
-        <w:rPr>
-          <w:lang w:val="en-IL"/>
-        </w:rPr>
-        <w:t xml:space="preserve"> tell the brain: </w:t>
+      <w:r>
+        <w:t xml:space="preserve">These micro-behaviors tell the brain: </w:t>
       </w:r>
       <w:r>
         <w:rPr>
           <w:i/>
           <w:iCs/>
-          <w:lang w:val="en-IL"/>
         </w:rPr>
         <w:t>I lead my day; the day doesn’t lead me.</w:t>
       </w:r>
     </w:p>
     <w:p>
-      <w:pPr>
-        <w:rPr>
-          <w:lang w:val="en-IL"/>
-        </w:rPr>
-      </w:pPr>
-      <w:r>
-        <w:rPr>
-          <w:lang w:val="en-IL"/>
-        </w:rPr>
+      <w:r>
         <w:t xml:space="preserve">Research in psychology consistently shows that </w:t>
       </w:r>
       <w:r>
         <w:rPr>
           <w:b/>
           <w:bCs/>
-          <w:lang w:val="en-IL"/>
         </w:rPr>
         <w:t>the feeling of control</w:t>
       </w:r>
       <w:r>
-        <w:rPr>
-          <w:lang w:val="en-IL"/>
-        </w:rPr>
         <w:t>, even in tiny doses, reduces stress and increases happiness. You're not trying to control outcomes—you're simply controlling the first moment of the day.</w:t>
       </w:r>
     </w:p>
     <w:p>
-      <w:pPr>
-        <w:rPr>
-          <w:lang w:val="en-IL"/>
-        </w:rPr>
-      </w:pPr>
-      <w:r>
-        <w:rPr>
-          <w:lang w:val="en-IL"/>
-        </w:rPr>
+      <w:r>
         <w:t>This habit helps you walk into the world stronger, calmer, and mentally organized.</w:t>
       </w:r>
     </w:p>
     <w:p>
-      <w:pPr>
-        <w:rPr>
-          <w:lang w:val="en-IL"/>
-        </w:rPr>
-      </w:pPr>
-      <w:r>
-        <w:rPr>
-          <w:lang w:val="en-IL"/>
-        </w:rPr>
-        <w:pict w14:anchorId="65819EAF">
-          <v:rect id="_x0000_i1081" style="width:0;height:1.5pt" o:hralign="center" o:hrstd="t" o:hr="t" fillcolor="#a0a0a0" stroked="f"/>
+      <w:r>
+        <w:rPr>
+          <w:noProof/>
+        </w:rPr>
+        <w:pict w14:anchorId="13DDCE85">
+          <v:rect id="_x0000_i1030" alt="" style="width:415.3pt;height:.05pt;mso-width-percent:0;mso-height-percent:0;mso-width-percent:0;mso-height-percent:0" o:hralign="center" o:hrstd="t" o:hr="t" fillcolor="#a0a0a0" stroked="f"/>
         </w:pict>
       </w:r>
     </w:p>
@@ -326,55 +194,33 @@
         <w:rPr>
           <w:b/>
           <w:bCs/>
-          <w:lang w:val="en-IL"/>
-        </w:rPr>
-      </w:pPr>
-      <w:r>
-        <w:rPr>
-          <w:b/>
-          <w:bCs/>
-          <w:lang w:val="en-IL"/>
+        </w:rPr>
+      </w:pPr>
+      <w:r>
+        <w:rPr>
+          <w:b/>
+          <w:bCs/>
         </w:rPr>
         <w:t>2. Do One Thing That Makes You Feel Progress</w:t>
       </w:r>
     </w:p>
     <w:p>
-      <w:pPr>
-        <w:rPr>
-          <w:lang w:val="en-IL"/>
-        </w:rPr>
-      </w:pPr>
-      <w:r>
-        <w:rPr>
-          <w:lang w:val="en-IL"/>
-        </w:rPr>
+      <w:r>
         <w:t>Happiness is deeply connected to a sense of progress—professionally or personally. Humans are wired to feel motivated when we see ourselves moving forward, even if the steps are tiny.</w:t>
       </w:r>
     </w:p>
     <w:p>
-      <w:pPr>
-        <w:rPr>
-          <w:lang w:val="en-IL"/>
-        </w:rPr>
-      </w:pPr>
-      <w:r>
-        <w:rPr>
-          <w:lang w:val="en-IL"/>
-        </w:rPr>
+      <w:r>
         <w:t xml:space="preserve">Every day, choose </w:t>
       </w:r>
       <w:r>
         <w:rPr>
           <w:b/>
           <w:bCs/>
-          <w:lang w:val="en-IL"/>
         </w:rPr>
         <w:t>one micro-action</w:t>
       </w:r>
       <w:r>
-        <w:rPr>
-          <w:lang w:val="en-IL"/>
-        </w:rPr>
         <w:t xml:space="preserve"> that creates progress:</w:t>
       </w:r>
     </w:p>
@@ -384,15 +230,8 @@
           <w:ilvl w:val="0"/>
           <w:numId w:val="2"/>
         </w:numPr>
-        <w:rPr>
-          <w:lang w:val="en-IL"/>
-        </w:rPr>
-      </w:pPr>
-      <w:r>
-        <w:rPr>
-          <w:lang w:val="en-IL"/>
-        </w:rPr>
-        <w:lastRenderedPageBreak/>
+      </w:pPr>
+      <w:r>
         <w:t>Learn one new idea</w:t>
       </w:r>
     </w:p>
@@ -402,14 +241,9 @@
           <w:ilvl w:val="0"/>
           <w:numId w:val="2"/>
         </w:numPr>
-        <w:rPr>
-          <w:lang w:val="en-IL"/>
-        </w:rPr>
-      </w:pPr>
-      <w:r>
-        <w:rPr>
-          <w:lang w:val="en-IL"/>
-        </w:rPr>
+      </w:pPr>
+      <w:r>
+        <w:lastRenderedPageBreak/>
         <w:t>Write five important sentences</w:t>
       </w:r>
     </w:p>
@@ -419,14 +253,8 @@
           <w:ilvl w:val="0"/>
           <w:numId w:val="2"/>
         </w:numPr>
-        <w:rPr>
-          <w:lang w:val="en-IL"/>
-        </w:rPr>
-      </w:pPr>
-      <w:r>
-        <w:rPr>
-          <w:lang w:val="en-IL"/>
-        </w:rPr>
+      </w:pPr>
+      <w:r>
         <w:t>Clean one small area</w:t>
       </w:r>
     </w:p>
@@ -436,14 +264,8 @@
           <w:ilvl w:val="0"/>
           <w:numId w:val="2"/>
         </w:numPr>
-        <w:rPr>
-          <w:lang w:val="en-IL"/>
-        </w:rPr>
-      </w:pPr>
-      <w:r>
-        <w:rPr>
-          <w:lang w:val="en-IL"/>
-        </w:rPr>
+      </w:pPr>
+      <w:r>
         <w:t>Complete a short work task that you’ve been postponing</w:t>
       </w:r>
     </w:p>
@@ -453,82 +275,43 @@
           <w:ilvl w:val="0"/>
           <w:numId w:val="2"/>
         </w:numPr>
-        <w:rPr>
-          <w:lang w:val="en-IL"/>
-        </w:rPr>
-      </w:pPr>
-      <w:r>
-        <w:rPr>
-          <w:lang w:val="en-IL"/>
-        </w:rPr>
+      </w:pPr>
+      <w:r>
         <w:t>Make one “important but non-urgent” improvement in your business or life</w:t>
       </w:r>
     </w:p>
     <w:p>
-      <w:pPr>
-        <w:rPr>
-          <w:lang w:val="en-IL"/>
-        </w:rPr>
-      </w:pPr>
-      <w:r>
-        <w:rPr>
-          <w:lang w:val="en-IL"/>
-        </w:rPr>
+      <w:r>
         <w:t>This is not about productivity hacks; it’s about direction.</w:t>
       </w:r>
     </w:p>
     <w:p>
-      <w:pPr>
-        <w:rPr>
-          <w:lang w:val="en-IL"/>
-        </w:rPr>
-      </w:pPr>
-      <w:r>
-        <w:rPr>
-          <w:lang w:val="en-IL"/>
-        </w:rPr>
+      <w:r>
         <w:t>When people feel stuck, they become unhappy. When they feel that life is moving—even slowly—they become energized, optimistic, and creative.</w:t>
       </w:r>
     </w:p>
     <w:p>
-      <w:pPr>
-        <w:rPr>
-          <w:lang w:val="en-IL"/>
-        </w:rPr>
-      </w:pPr>
-      <w:r>
-        <w:rPr>
-          <w:lang w:val="en-IL"/>
-        </w:rPr>
+      <w:r>
         <w:t xml:space="preserve">The goal is simple: </w:t>
       </w:r>
       <w:r>
         <w:rPr>
           <w:b/>
           <w:bCs/>
-          <w:lang w:val="en-IL"/>
         </w:rPr>
         <w:t>finish the day knowing you have moved 1% forward.</w:t>
       </w:r>
       <w:r>
-        <w:rPr>
-          <w:lang w:val="en-IL"/>
-        </w:rPr>
         <w:t xml:space="preserve"> Those daily 1% steps accumulate faster than people imagine.</w:t>
       </w:r>
     </w:p>
     <w:p>
-      <w:pPr>
-        <w:rPr>
-          <w:lang w:val="en-IL"/>
-        </w:rPr>
-      </w:pPr>
-      <w:r>
-        <w:rPr>
-          <w:lang w:val="en-IL"/>
-        </w:rPr>
-        <w:pict w14:anchorId="38B19357">
-          <v:rect id="_x0000_i1082" style="width:0;height:1.5pt" o:hralign="center" o:hrstd="t" o:hr="t" fillcolor="#a0a0a0" stroked="f"/>
+      <w:r>
+        <w:rPr>
+          <w:noProof/>
+        </w:rPr>
+        <w:pict w14:anchorId="2444AB08">
+          <v:rect id="_x0000_i1029" alt="" style="width:415.3pt;height:.05pt;mso-width-percent:0;mso-height-percent:0;mso-width-percent:0;mso-height-percent:0" o:hralign="center" o:hrstd="t" o:hr="t" fillcolor="#a0a0a0" stroked="f"/>
         </w:pict>
       </w:r>
     </w:p>
@@ -537,41 +320,23 @@
         <w:rPr>
           <w:b/>
           <w:bCs/>
-          <w:lang w:val="en-IL"/>
-        </w:rPr>
-      </w:pPr>
-      <w:r>
-        <w:rPr>
-          <w:b/>
-          <w:bCs/>
-          <w:lang w:val="en-IL"/>
+        </w:rPr>
+      </w:pPr>
+      <w:r>
+        <w:rPr>
+          <w:b/>
+          <w:bCs/>
         </w:rPr>
         <w:t>3. Be Present for One Human Connection</w:t>
       </w:r>
     </w:p>
     <w:p>
-      <w:pPr>
-        <w:rPr>
-          <w:lang w:val="en-IL"/>
-        </w:rPr>
-      </w:pPr>
-      <w:r>
-        <w:rPr>
-          <w:lang w:val="en-IL"/>
-        </w:rPr>
+      <w:r>
         <w:t>Humans are social creatures, and isolation—mental or emotional—kills happiness faster than anything else. Being connected doesn’t mean being with people all the time. It means having at least one genuine moment every day where you show presence, attention, and empathy.</w:t>
       </w:r>
     </w:p>
     <w:p>
-      <w:pPr>
-        <w:rPr>
-          <w:lang w:val="en-IL"/>
-        </w:rPr>
-      </w:pPr>
-      <w:r>
-        <w:rPr>
-          <w:lang w:val="en-IL"/>
-        </w:rPr>
+      <w:r>
         <w:t>This can be very small:</w:t>
       </w:r>
     </w:p>
@@ -581,14 +346,8 @@
           <w:ilvl w:val="0"/>
           <w:numId w:val="3"/>
         </w:numPr>
-        <w:rPr>
-          <w:lang w:val="en-IL"/>
-        </w:rPr>
-      </w:pPr>
-      <w:r>
-        <w:rPr>
-          <w:lang w:val="en-IL"/>
-        </w:rPr>
+      </w:pPr>
+      <w:r>
         <w:t>A warm conversation with a partner or child</w:t>
       </w:r>
     </w:p>
@@ -598,29 +357,9 @@
           <w:ilvl w:val="0"/>
           <w:numId w:val="3"/>
         </w:numPr>
-        <w:rPr>
-          <w:lang w:val="en-IL"/>
-        </w:rPr>
-      </w:pPr>
-      <w:r>
-        <w:rPr>
-          <w:lang w:val="en-IL"/>
-        </w:rPr>
-        <w:t xml:space="preserve">A voice </w:t>
-      </w:r>
-      <w:proofErr w:type="gramStart"/>
-      <w:r>
-        <w:rPr>
-          <w:lang w:val="en-IL"/>
-        </w:rPr>
-        <w:t>note</w:t>
-      </w:r>
-      <w:proofErr w:type="gramEnd"/>
-      <w:r>
-        <w:rPr>
-          <w:lang w:val="en-IL"/>
-        </w:rPr>
-        <w:t xml:space="preserve"> to a friend</w:t>
+      </w:pPr>
+      <w:r>
+        <w:t>A voice note to a friend</w:t>
       </w:r>
     </w:p>
     <w:p>
@@ -629,14 +368,8 @@
           <w:ilvl w:val="0"/>
           <w:numId w:val="3"/>
         </w:numPr>
-        <w:rPr>
-          <w:lang w:val="en-IL"/>
-        </w:rPr>
-      </w:pPr>
-      <w:r>
-        <w:rPr>
-          <w:lang w:val="en-IL"/>
-        </w:rPr>
+      </w:pPr>
+      <w:r>
         <w:t>A smile or kind word to a colleague</w:t>
       </w:r>
     </w:p>
@@ -646,14 +379,8 @@
           <w:ilvl w:val="0"/>
           <w:numId w:val="3"/>
         </w:numPr>
-        <w:rPr>
-          <w:lang w:val="en-IL"/>
-        </w:rPr>
-      </w:pPr>
-      <w:r>
-        <w:rPr>
-          <w:lang w:val="en-IL"/>
-        </w:rPr>
+      </w:pPr>
+      <w:r>
         <w:t>Listening without interrupting</w:t>
       </w:r>
     </w:p>
@@ -663,27 +390,13 @@
           <w:ilvl w:val="0"/>
           <w:numId w:val="3"/>
         </w:numPr>
-        <w:rPr>
-          <w:lang w:val="en-IL"/>
-        </w:rPr>
-      </w:pPr>
-      <w:r>
-        <w:rPr>
-          <w:lang w:val="en-IL"/>
-        </w:rPr>
+      </w:pPr>
+      <w:r>
         <w:t>A short call to check in on someone</w:t>
       </w:r>
     </w:p>
     <w:p>
-      <w:pPr>
-        <w:rPr>
-          <w:lang w:val="en-IL"/>
-        </w:rPr>
-      </w:pPr>
-      <w:r>
-        <w:rPr>
-          <w:lang w:val="en-IL"/>
-        </w:rPr>
+      <w:r>
         <w:t>When you give someone 2–3 minutes of real attention, you feel happier because:</w:t>
       </w:r>
     </w:p>
@@ -693,14 +406,8 @@
           <w:ilvl w:val="0"/>
           <w:numId w:val="4"/>
         </w:numPr>
-        <w:rPr>
-          <w:lang w:val="en-IL"/>
-        </w:rPr>
-      </w:pPr>
-      <w:r>
-        <w:rPr>
-          <w:lang w:val="en-IL"/>
-        </w:rPr>
+      </w:pPr>
+      <w:r>
         <w:t>You create meaning</w:t>
       </w:r>
     </w:p>
@@ -710,14 +417,8 @@
           <w:ilvl w:val="0"/>
           <w:numId w:val="4"/>
         </w:numPr>
-        <w:rPr>
-          <w:lang w:val="en-IL"/>
-        </w:rPr>
-      </w:pPr>
-      <w:r>
-        <w:rPr>
-          <w:lang w:val="en-IL"/>
-        </w:rPr>
+      </w:pPr>
+      <w:r>
         <w:t>You reinforce your identity as someone who cares</w:t>
       </w:r>
     </w:p>
@@ -727,56 +428,33 @@
           <w:ilvl w:val="0"/>
           <w:numId w:val="4"/>
         </w:numPr>
-        <w:rPr>
-          <w:lang w:val="en-IL"/>
-        </w:rPr>
-      </w:pPr>
-      <w:r>
-        <w:rPr>
-          <w:lang w:val="en-IL"/>
-        </w:rPr>
+      </w:pPr>
+      <w:r>
         <w:t>Connection releases oxytocin—the “calm and trust” hormone</w:t>
       </w:r>
     </w:p>
     <w:p>
-      <w:pPr>
-        <w:rPr>
-          <w:lang w:val="en-IL"/>
-        </w:rPr>
-      </w:pPr>
-      <w:r>
-        <w:rPr>
-          <w:lang w:val="en-IL"/>
-        </w:rPr>
+      <w:r>
         <w:t xml:space="preserve">In a digital, high-pressure world, </w:t>
       </w:r>
       <w:r>
         <w:rPr>
           <w:b/>
           <w:bCs/>
-          <w:lang w:val="en-IL"/>
         </w:rPr>
         <w:t>moments of connection are emotional vitamins</w:t>
       </w:r>
       <w:r>
-        <w:rPr>
-          <w:lang w:val="en-IL"/>
-        </w:rPr>
         <w:t>. Taking one a day keeps your emotional system healthy.</w:t>
       </w:r>
     </w:p>
     <w:p>
-      <w:pPr>
-        <w:rPr>
-          <w:lang w:val="en-IL"/>
-        </w:rPr>
-      </w:pPr>
-      <w:r>
-        <w:rPr>
-          <w:lang w:val="en-IL"/>
-        </w:rPr>
-        <w:pict w14:anchorId="0F6E3C70">
-          <v:rect id="_x0000_i1083" style="width:0;height:1.5pt" o:hralign="center" o:hrstd="t" o:hr="t" fillcolor="#a0a0a0" stroked="f"/>
+      <w:r>
+        <w:rPr>
+          <w:noProof/>
+        </w:rPr>
+        <w:pict w14:anchorId="4B625FB1">
+          <v:rect id="_x0000_i1028" alt="" style="width:415.3pt;height:.05pt;mso-width-percent:0;mso-height-percent:0;mso-width-percent:0;mso-height-percent:0" o:hralign="center" o:hrstd="t" o:hr="t" fillcolor="#a0a0a0" stroked="f"/>
         </w:pict>
       </w:r>
     </w:p>
@@ -785,69 +463,39 @@
         <w:rPr>
           <w:b/>
           <w:bCs/>
-          <w:lang w:val="en-IL"/>
-        </w:rPr>
-      </w:pPr>
-      <w:r>
-        <w:rPr>
-          <w:b/>
-          <w:bCs/>
-          <w:lang w:val="en-IL"/>
+        </w:rPr>
+      </w:pPr>
+      <w:r>
+        <w:rPr>
+          <w:b/>
+          <w:bCs/>
         </w:rPr>
         <w:t>4. Move Your Body for 5–10 Minutes</w:t>
       </w:r>
     </w:p>
     <w:p>
-      <w:pPr>
-        <w:rPr>
-          <w:lang w:val="en-IL"/>
-        </w:rPr>
-      </w:pPr>
-      <w:r>
-        <w:rPr>
-          <w:lang w:val="en-IL"/>
-        </w:rPr>
+      <w:r>
+        <w:t>You don’t need a full workout to feel happier—you need motion. Movement changes your blood flow, reduces stress hormones, increases energy, and clears mental fog.</w:t>
+      </w:r>
+    </w:p>
+    <w:p>
+      <w:r>
         <w:lastRenderedPageBreak/>
-        <w:t>You don’t need a full workout to feel happier—you need motion. Movement changes your blood flow, reduces stress hormones, increases energy, and clears mental fog.</w:t>
-      </w:r>
-    </w:p>
-    <w:p>
-      <w:pPr>
-        <w:rPr>
-          <w:lang w:val="en-IL"/>
-        </w:rPr>
-      </w:pPr>
-      <w:r>
-        <w:rPr>
-          <w:lang w:val="en-IL"/>
-        </w:rPr>
         <w:t xml:space="preserve">Most people think exercise = gym. But happiness requires something simpler: </w:t>
       </w:r>
       <w:r>
         <w:rPr>
           <w:b/>
           <w:bCs/>
-          <w:lang w:val="en-IL"/>
         </w:rPr>
         <w:t>activate your body daily</w:t>
       </w:r>
       <w:r>
-        <w:rPr>
-          <w:lang w:val="en-IL"/>
-        </w:rPr>
         <w:t>.</w:t>
       </w:r>
     </w:p>
     <w:p>
-      <w:pPr>
-        <w:rPr>
-          <w:lang w:val="en-IL"/>
-        </w:rPr>
-      </w:pPr>
-      <w:r>
-        <w:rPr>
-          <w:lang w:val="en-IL"/>
-        </w:rPr>
+      <w:r>
         <w:t>Examples:</w:t>
       </w:r>
     </w:p>
@@ -857,14 +505,8 @@
           <w:ilvl w:val="0"/>
           <w:numId w:val="5"/>
         </w:numPr>
-        <w:rPr>
-          <w:lang w:val="en-IL"/>
-        </w:rPr>
-      </w:pPr>
-      <w:r>
-        <w:rPr>
-          <w:lang w:val="en-IL"/>
-        </w:rPr>
+      </w:pPr>
+      <w:r>
         <w:t>10-minute walk</w:t>
       </w:r>
     </w:p>
@@ -874,14 +516,8 @@
           <w:ilvl w:val="0"/>
           <w:numId w:val="5"/>
         </w:numPr>
-        <w:rPr>
-          <w:lang w:val="en-IL"/>
-        </w:rPr>
-      </w:pPr>
-      <w:r>
-        <w:rPr>
-          <w:lang w:val="en-IL"/>
-        </w:rPr>
+      </w:pPr>
+      <w:r>
         <w:t>Light stretching</w:t>
       </w:r>
     </w:p>
@@ -891,14 +527,8 @@
           <w:ilvl w:val="0"/>
           <w:numId w:val="5"/>
         </w:numPr>
-        <w:rPr>
-          <w:lang w:val="en-IL"/>
-        </w:rPr>
-      </w:pPr>
-      <w:r>
-        <w:rPr>
-          <w:lang w:val="en-IL"/>
-        </w:rPr>
+      </w:pPr>
+      <w:r>
         <w:t>A short breathing practice</w:t>
       </w:r>
     </w:p>
@@ -908,14 +538,8 @@
           <w:ilvl w:val="0"/>
           <w:numId w:val="5"/>
         </w:numPr>
-        <w:rPr>
-          <w:lang w:val="en-IL"/>
-        </w:rPr>
-      </w:pPr>
-      <w:r>
-        <w:rPr>
-          <w:lang w:val="en-IL"/>
-        </w:rPr>
+      </w:pPr>
+      <w:r>
         <w:t>Playing with your kids</w:t>
       </w:r>
     </w:p>
@@ -925,14 +549,8 @@
           <w:ilvl w:val="0"/>
           <w:numId w:val="5"/>
         </w:numPr>
-        <w:rPr>
-          <w:lang w:val="en-IL"/>
-        </w:rPr>
-      </w:pPr>
-      <w:r>
-        <w:rPr>
-          <w:lang w:val="en-IL"/>
-        </w:rPr>
+      </w:pPr>
+      <w:r>
         <w:t>Dancing to one song</w:t>
       </w:r>
     </w:p>
@@ -942,96 +560,53 @@
           <w:ilvl w:val="0"/>
           <w:numId w:val="5"/>
         </w:numPr>
-        <w:rPr>
-          <w:lang w:val="en-IL"/>
-        </w:rPr>
-      </w:pPr>
-      <w:r>
-        <w:rPr>
-          <w:lang w:val="en-IL"/>
-        </w:rPr>
+      </w:pPr>
+      <w:r>
         <w:t>Going up and down the stairs twice</w:t>
       </w:r>
     </w:p>
     <w:p>
-      <w:pPr>
-        <w:rPr>
-          <w:lang w:val="en-IL"/>
-        </w:rPr>
-      </w:pPr>
-      <w:r>
-        <w:rPr>
-          <w:lang w:val="en-IL"/>
-        </w:rPr>
+      <w:r>
         <w:t xml:space="preserve">The key is </w:t>
       </w:r>
       <w:r>
         <w:rPr>
           <w:i/>
           <w:iCs/>
-          <w:lang w:val="en-IL"/>
         </w:rPr>
         <w:t>consistency</w:t>
       </w:r>
       <w:r>
-        <w:rPr>
-          <w:lang w:val="en-IL"/>
-        </w:rPr>
         <w:t>, not intensity.</w:t>
       </w:r>
     </w:p>
     <w:p>
-      <w:pPr>
-        <w:rPr>
-          <w:lang w:val="en-IL"/>
-        </w:rPr>
-      </w:pPr>
-      <w:r>
-        <w:rPr>
-          <w:lang w:val="en-IL"/>
-        </w:rPr>
+      <w:r>
         <w:t xml:space="preserve">A body that stays stagnant sends signals of fatigue and heaviness to the brain. A body that moves tells the brain: </w:t>
       </w:r>
       <w:r>
         <w:rPr>
           <w:i/>
           <w:iCs/>
-          <w:lang w:val="en-IL"/>
         </w:rPr>
         <w:t>we are alive, energetic, capable</w:t>
       </w:r>
       <w:r>
-        <w:rPr>
-          <w:lang w:val="en-IL"/>
-        </w:rPr>
         <w:t>.</w:t>
       </w:r>
     </w:p>
     <w:p>
-      <w:pPr>
-        <w:rPr>
-          <w:lang w:val="en-IL"/>
-        </w:rPr>
-      </w:pPr>
-      <w:r>
-        <w:rPr>
-          <w:lang w:val="en-IL"/>
-        </w:rPr>
+      <w:r>
         <w:t>Daily movement builds emotional stability. You become more resilient, more optimistic, and less reactive. It’s one of the fastest biological shortcuts to happiness.</w:t>
       </w:r>
     </w:p>
     <w:p>
-      <w:pPr>
-        <w:rPr>
-          <w:lang w:val="en-IL"/>
-        </w:rPr>
-      </w:pPr>
-      <w:r>
-        <w:rPr>
-          <w:lang w:val="en-IL"/>
-        </w:rPr>
-        <w:pict w14:anchorId="13114146">
-          <v:rect id="_x0000_i1084" style="width:0;height:1.5pt" o:hralign="center" o:hrstd="t" o:hr="t" fillcolor="#a0a0a0" stroked="f"/>
+      <w:r>
+        <w:rPr>
+          <w:noProof/>
+        </w:rPr>
+        <w:pict w14:anchorId="0E769DF1">
+          <v:rect id="_x0000_i1027" alt="" style="width:415.3pt;height:.05pt;mso-width-percent:0;mso-height-percent:0;mso-width-percent:0;mso-height-percent:0" o:hralign="center" o:hrstd="t" o:hr="t" fillcolor="#a0a0a0" stroked="f"/>
         </w:pict>
       </w:r>
     </w:p>
@@ -1040,68 +615,38 @@
         <w:rPr>
           <w:b/>
           <w:bCs/>
-          <w:lang w:val="en-IL"/>
-        </w:rPr>
-      </w:pPr>
-      <w:r>
-        <w:rPr>
-          <w:b/>
-          <w:bCs/>
-          <w:lang w:val="en-IL"/>
+        </w:rPr>
+      </w:pPr>
+      <w:r>
+        <w:rPr>
+          <w:b/>
+          <w:bCs/>
         </w:rPr>
         <w:t>5. End the Day with a “Reset Ritual”</w:t>
       </w:r>
     </w:p>
     <w:p>
-      <w:pPr>
-        <w:rPr>
-          <w:lang w:val="en-IL"/>
-        </w:rPr>
-      </w:pPr>
-      <w:r>
-        <w:rPr>
-          <w:lang w:val="en-IL"/>
-        </w:rPr>
+      <w:r>
         <w:t>Happiness is not just about how you start your day; it’s also about how you close it. Many people carry the entire day into the night—unfinished tasks, worries, emotional residue. This creates mental overload, poor sleep, and constant tension.</w:t>
       </w:r>
     </w:p>
     <w:p>
-      <w:pPr>
-        <w:rPr>
-          <w:lang w:val="en-IL"/>
-        </w:rPr>
-      </w:pPr>
-      <w:r>
-        <w:rPr>
-          <w:lang w:val="en-IL"/>
-        </w:rPr>
+      <w:r>
         <w:t xml:space="preserve">A daily </w:t>
       </w:r>
       <w:r>
         <w:rPr>
           <w:b/>
           <w:bCs/>
-          <w:lang w:val="en-IL"/>
         </w:rPr>
         <w:t>reset ritual</w:t>
       </w:r>
       <w:r>
-        <w:rPr>
-          <w:lang w:val="en-IL"/>
-        </w:rPr>
         <w:t xml:space="preserve"> releases the day and gives your mind permission to rest.</w:t>
       </w:r>
     </w:p>
     <w:p>
-      <w:pPr>
-        <w:rPr>
-          <w:lang w:val="en-IL"/>
-        </w:rPr>
-      </w:pPr>
-      <w:r>
-        <w:rPr>
-          <w:lang w:val="en-IL"/>
-        </w:rPr>
+      <w:r>
         <w:t>Your reset ritual can be extremely simple:</w:t>
       </w:r>
     </w:p>
@@ -1111,14 +656,8 @@
           <w:ilvl w:val="0"/>
           <w:numId w:val="6"/>
         </w:numPr>
-        <w:rPr>
-          <w:lang w:val="en-IL"/>
-        </w:rPr>
-      </w:pPr>
-      <w:r>
-        <w:rPr>
-          <w:lang w:val="en-IL"/>
-        </w:rPr>
+      </w:pPr>
+      <w:r>
         <w:t>Write down 3 things you completed today</w:t>
       </w:r>
     </w:p>
@@ -1128,14 +667,8 @@
           <w:ilvl w:val="0"/>
           <w:numId w:val="6"/>
         </w:numPr>
-        <w:rPr>
-          <w:lang w:val="en-IL"/>
-        </w:rPr>
-      </w:pPr>
-      <w:r>
-        <w:rPr>
-          <w:lang w:val="en-IL"/>
-        </w:rPr>
+      </w:pPr>
+      <w:r>
         <w:t>Note 1 thing you want to improve tomorrow—but without judgment</w:t>
       </w:r>
     </w:p>
@@ -1145,14 +678,8 @@
           <w:ilvl w:val="0"/>
           <w:numId w:val="6"/>
         </w:numPr>
-        <w:rPr>
-          <w:lang w:val="en-IL"/>
-        </w:rPr>
-      </w:pPr>
-      <w:r>
-        <w:rPr>
-          <w:lang w:val="en-IL"/>
-        </w:rPr>
+      </w:pPr>
+      <w:r>
         <w:t>Put your phone away 20 minutes before sleep</w:t>
       </w:r>
     </w:p>
@@ -1162,14 +689,8 @@
           <w:ilvl w:val="0"/>
           <w:numId w:val="6"/>
         </w:numPr>
-        <w:rPr>
-          <w:lang w:val="en-IL"/>
-        </w:rPr>
-      </w:pPr>
-      <w:r>
-        <w:rPr>
-          <w:lang w:val="en-IL"/>
-        </w:rPr>
+      </w:pPr>
+      <w:r>
         <w:t>Take a warm shower to physically “wash off” the day</w:t>
       </w:r>
     </w:p>
@@ -1179,14 +700,8 @@
           <w:ilvl w:val="0"/>
           <w:numId w:val="6"/>
         </w:numPr>
-        <w:rPr>
-          <w:lang w:val="en-IL"/>
-        </w:rPr>
-      </w:pPr>
-      <w:r>
-        <w:rPr>
-          <w:lang w:val="en-IL"/>
-        </w:rPr>
+      </w:pPr>
+      <w:r>
         <w:t>Listen to calming music</w:t>
       </w:r>
     </w:p>
@@ -1196,94 +711,56 @@
           <w:ilvl w:val="0"/>
           <w:numId w:val="6"/>
         </w:numPr>
-        <w:rPr>
-          <w:lang w:val="en-IL"/>
-        </w:rPr>
-      </w:pPr>
-      <w:r>
-        <w:rPr>
-          <w:lang w:val="en-IL"/>
-        </w:rPr>
+      </w:pPr>
+      <w:r>
         <w:t>Slow breathing for 60 seconds</w:t>
       </w:r>
     </w:p>
     <w:p>
-      <w:pPr>
-        <w:rPr>
-          <w:lang w:val="en-IL"/>
-        </w:rPr>
-      </w:pPr>
-      <w:r>
-        <w:rPr>
-          <w:lang w:val="en-IL"/>
-        </w:rPr>
+      <w:r>
         <w:t xml:space="preserve">This ritual tells your brain: </w:t>
       </w:r>
       <w:r>
         <w:rPr>
           <w:i/>
           <w:iCs/>
-          <w:lang w:val="en-IL"/>
         </w:rPr>
         <w:t>the day is closed; you did enough; it’s safe to rest.</w:t>
       </w:r>
     </w:p>
     <w:p>
-      <w:pPr>
-        <w:rPr>
-          <w:lang w:val="en-IL"/>
-        </w:rPr>
-      </w:pPr>
-      <w:r>
-        <w:rPr>
-          <w:lang w:val="en-IL"/>
+      <w:r>
+        <w:t>People who master this practice experience less stress, deeper sleep, and a more stable emotional tone the next day.</w:t>
+      </w:r>
+    </w:p>
+    <w:p>
+      <w:r>
+        <w:rPr>
+          <w:noProof/>
+        </w:rPr>
+        <w:pict w14:anchorId="325A996C">
+          <v:rect id="_x0000_i1026" alt="" style="width:415.3pt;height:.05pt;mso-width-percent:0;mso-height-percent:0;mso-width-percent:0;mso-height-percent:0" o:hralign="center" o:hrstd="t" o:hr="t" fillcolor="#a0a0a0" stroked="f"/>
+        </w:pict>
+      </w:r>
+    </w:p>
+    <w:p>
+      <w:pPr>
+        <w:rPr>
+          <w:b/>
+          <w:bCs/>
+        </w:rPr>
+      </w:pPr>
+      <w:r>
+        <w:rPr>
+          <w:b/>
+          <w:bCs/>
         </w:rPr>
         <w:lastRenderedPageBreak/>
-        <w:t>People who master this practice experience less stress, deeper sleep, and a more stable emotional tone the next day.</w:t>
-      </w:r>
-    </w:p>
-    <w:p>
-      <w:pPr>
-        <w:rPr>
-          <w:lang w:val="en-IL"/>
-        </w:rPr>
-      </w:pPr>
-      <w:r>
-        <w:rPr>
-          <w:lang w:val="en-IL"/>
-        </w:rPr>
-        <w:pict w14:anchorId="1801D0D5">
-          <v:rect id="_x0000_i1085" style="width:0;height:1.5pt" o:hralign="center" o:hrstd="t" o:hr="t" fillcolor="#a0a0a0" stroked="f"/>
-        </w:pict>
-      </w:r>
-    </w:p>
-    <w:p>
-      <w:pPr>
-        <w:rPr>
-          <w:b/>
-          <w:bCs/>
-          <w:lang w:val="en-IL"/>
-        </w:rPr>
-      </w:pPr>
-      <w:r>
-        <w:rPr>
-          <w:b/>
-          <w:bCs/>
-          <w:lang w:val="en-IL"/>
-        </w:rPr>
         <w:t>Why These Five Habits Work Together</w:t>
       </w:r>
     </w:p>
     <w:p>
-      <w:pPr>
-        <w:rPr>
-          <w:lang w:val="en-IL"/>
-        </w:rPr>
-      </w:pPr>
-      <w:r>
-        <w:rPr>
-          <w:lang w:val="en-IL"/>
-        </w:rPr>
+      <w:r>
         <w:t>Each habit influences a different layer of your psychological system:</w:t>
       </w:r>
     </w:p>
@@ -1292,28 +769,18 @@
         <w:rPr>
           <w:b/>
           <w:bCs/>
-          <w:lang w:val="en-IL"/>
-        </w:rPr>
-      </w:pPr>
-      <w:r>
-        <w:rPr>
-          <w:b/>
-          <w:bCs/>
-          <w:lang w:val="en-IL"/>
+        </w:rPr>
+      </w:pPr>
+      <w:r>
+        <w:rPr>
+          <w:b/>
+          <w:bCs/>
         </w:rPr>
         <w:t>1. Morning Control → Mindset</w:t>
       </w:r>
     </w:p>
     <w:p>
-      <w:pPr>
-        <w:rPr>
-          <w:lang w:val="en-IL"/>
-        </w:rPr>
-      </w:pPr>
-      <w:r>
-        <w:rPr>
-          <w:lang w:val="en-IL"/>
-        </w:rPr>
+      <w:r>
         <w:t>It gives clarity, direction, and emotional strength.</w:t>
       </w:r>
     </w:p>
@@ -1322,28 +789,18 @@
         <w:rPr>
           <w:b/>
           <w:bCs/>
-          <w:lang w:val="en-IL"/>
-        </w:rPr>
-      </w:pPr>
-      <w:r>
-        <w:rPr>
-          <w:b/>
-          <w:bCs/>
-          <w:lang w:val="en-IL"/>
+        </w:rPr>
+      </w:pPr>
+      <w:r>
+        <w:rPr>
+          <w:b/>
+          <w:bCs/>
         </w:rPr>
         <w:t>2. Micro-Progress → Motivation</w:t>
       </w:r>
     </w:p>
     <w:p>
-      <w:pPr>
-        <w:rPr>
-          <w:lang w:val="en-IL"/>
-        </w:rPr>
-      </w:pPr>
-      <w:r>
-        <w:rPr>
-          <w:lang w:val="en-IL"/>
-        </w:rPr>
+      <w:r>
         <w:t>It triggers the feeling of purpose and momentum.</w:t>
       </w:r>
     </w:p>
@@ -1352,28 +809,18 @@
         <w:rPr>
           <w:b/>
           <w:bCs/>
-          <w:lang w:val="en-IL"/>
-        </w:rPr>
-      </w:pPr>
-      <w:r>
-        <w:rPr>
-          <w:b/>
-          <w:bCs/>
-          <w:lang w:val="en-IL"/>
+        </w:rPr>
+      </w:pPr>
+      <w:r>
+        <w:rPr>
+          <w:b/>
+          <w:bCs/>
         </w:rPr>
         <w:t>3. Human Connection → Meaning</w:t>
       </w:r>
     </w:p>
     <w:p>
-      <w:pPr>
-        <w:rPr>
-          <w:lang w:val="en-IL"/>
-        </w:rPr>
-      </w:pPr>
-      <w:r>
-        <w:rPr>
-          <w:lang w:val="en-IL"/>
-        </w:rPr>
+      <w:r>
         <w:t>It creates warmth, bonding, and emotional richness.</w:t>
       </w:r>
     </w:p>
@@ -1382,28 +829,18 @@
         <w:rPr>
           <w:b/>
           <w:bCs/>
-          <w:lang w:val="en-IL"/>
-        </w:rPr>
-      </w:pPr>
-      <w:r>
-        <w:rPr>
-          <w:b/>
-          <w:bCs/>
-          <w:lang w:val="en-IL"/>
+        </w:rPr>
+      </w:pPr>
+      <w:r>
+        <w:rPr>
+          <w:b/>
+          <w:bCs/>
         </w:rPr>
         <w:t>4. Body Movement → Energy</w:t>
       </w:r>
     </w:p>
     <w:p>
-      <w:pPr>
-        <w:rPr>
-          <w:lang w:val="en-IL"/>
-        </w:rPr>
-      </w:pPr>
-      <w:r>
-        <w:rPr>
-          <w:lang w:val="en-IL"/>
-        </w:rPr>
+      <w:r>
         <w:t>It stabilizes mood, reduces stress, and increases vitality.</w:t>
       </w:r>
     </w:p>
@@ -1412,105 +849,55 @@
         <w:rPr>
           <w:b/>
           <w:bCs/>
-          <w:lang w:val="en-IL"/>
-        </w:rPr>
-      </w:pPr>
-      <w:r>
-        <w:rPr>
-          <w:b/>
-          <w:bCs/>
-          <w:lang w:val="en-IL"/>
+        </w:rPr>
+      </w:pPr>
+      <w:r>
+        <w:rPr>
+          <w:b/>
+          <w:bCs/>
         </w:rPr>
         <w:t>5. Evening Reset → Recovery</w:t>
       </w:r>
     </w:p>
     <w:p>
-      <w:pPr>
-        <w:rPr>
-          <w:lang w:val="en-IL"/>
-        </w:rPr>
-      </w:pPr>
-      <w:r>
-        <w:rPr>
-          <w:lang w:val="en-IL"/>
-        </w:rPr>
+      <w:r>
         <w:t>It repairs the mind and prepares you for tomorrow.</w:t>
       </w:r>
     </w:p>
     <w:p>
-      <w:pPr>
-        <w:rPr>
-          <w:lang w:val="en-IL"/>
-        </w:rPr>
-      </w:pPr>
-      <w:r>
-        <w:rPr>
-          <w:lang w:val="en-IL"/>
-        </w:rPr>
+      <w:r>
         <w:t xml:space="preserve">Together, they build a </w:t>
       </w:r>
       <w:r>
         <w:rPr>
           <w:b/>
           <w:bCs/>
-          <w:lang w:val="en-IL"/>
         </w:rPr>
         <w:t>daily happiness operating system</w:t>
       </w:r>
       <w:r>
-        <w:rPr>
-          <w:lang w:val="en-IL"/>
-        </w:rPr>
         <w:t>.</w:t>
       </w:r>
       <w:r>
-        <w:rPr>
-          <w:lang w:val="en-IL"/>
-        </w:rPr>
         <w:br/>
         <w:t>Not based on luck.</w:t>
       </w:r>
       <w:r>
-        <w:rPr>
-          <w:lang w:val="en-IL"/>
-        </w:rPr>
         <w:br/>
         <w:t>Not based on circumstances.</w:t>
       </w:r>
       <w:r>
-        <w:rPr>
-          <w:lang w:val="en-IL"/>
-        </w:rPr>
         <w:br/>
-        <w:t xml:space="preserve">But on repeatable </w:t>
-      </w:r>
-      <w:proofErr w:type="spellStart"/>
-      <w:r>
-        <w:rPr>
-          <w:lang w:val="en-IL"/>
-        </w:rPr>
-        <w:t>behaviors</w:t>
-      </w:r>
-      <w:proofErr w:type="spellEnd"/>
-      <w:r>
-        <w:rPr>
-          <w:lang w:val="en-IL"/>
-        </w:rPr>
-        <w:t xml:space="preserve"> you control.</w:t>
-      </w:r>
-    </w:p>
-    <w:p>
-      <w:pPr>
-        <w:rPr>
-          <w:lang w:val="en-IL"/>
-        </w:rPr>
-      </w:pPr>
-      <w:r>
-        <w:rPr>
-          <w:lang w:val="en-IL"/>
-        </w:rPr>
-        <w:pict w14:anchorId="18B529E9">
-          <v:rect id="_x0000_i1086" style="width:0;height:1.5pt" o:hralign="center" o:hrstd="t" o:hr="t" fillcolor="#a0a0a0" stroked="f"/>
+        <w:t>But on repeatable behaviors you control.</w:t>
+      </w:r>
+    </w:p>
+    <w:p>
+      <w:r>
+        <w:rPr>
+          <w:noProof/>
+        </w:rPr>
+        <w:pict w14:anchorId="380848AE">
+          <v:rect id="_x0000_i1025" alt="" style="width:415.3pt;height:.05pt;mso-width-percent:0;mso-height-percent:0;mso-width-percent:0;mso-height-percent:0" o:hralign="center" o:hrstd="t" o:hr="t" fillcolor="#a0a0a0" stroked="f"/>
         </w:pict>
       </w:r>
     </w:p>
@@ -1519,34 +906,21 @@
         <w:rPr>
           <w:b/>
           <w:bCs/>
-          <w:lang w:val="en-IL"/>
-        </w:rPr>
-      </w:pPr>
-      <w:r>
-        <w:rPr>
-          <w:b/>
-          <w:bCs/>
-          <w:lang w:val="en-IL"/>
+        </w:rPr>
+      </w:pPr>
+      <w:r>
+        <w:rPr>
+          <w:b/>
+          <w:bCs/>
         </w:rPr>
         <w:t>The Real Secret</w:t>
       </w:r>
     </w:p>
     <w:p>
-      <w:pPr>
-        <w:rPr>
-          <w:lang w:val="en-IL"/>
-        </w:rPr>
-      </w:pPr>
-      <w:r>
-        <w:rPr>
-          <w:lang w:val="en-IL"/>
-        </w:rPr>
+      <w:r>
         <w:t>Happiness is not found in huge life events.</w:t>
       </w:r>
       <w:r>
-        <w:rPr>
-          <w:lang w:val="en-IL"/>
-        </w:rPr>
         <w:br/>
         <w:t xml:space="preserve">It is created through </w:t>
       </w:r>
@@ -1554,50 +928,45 @@
         <w:rPr>
           <w:b/>
           <w:bCs/>
-          <w:lang w:val="en-IL"/>
         </w:rPr>
         <w:t>tiny daily investments</w:t>
       </w:r>
       <w:r>
-        <w:rPr>
-          <w:lang w:val="en-IL"/>
-        </w:rPr>
         <w:t xml:space="preserve"> in your mind, body, and relationships.</w:t>
       </w:r>
     </w:p>
     <w:p>
       <w:pPr>
         <w:rPr>
-          <w:lang w:val="en-IL"/>
-        </w:rPr>
-      </w:pPr>
-      <w:r>
-        <w:rPr>
-          <w:lang w:val="en-IL"/>
-        </w:rPr>
+          <w:lang w:val="en-US"/>
+        </w:rPr>
+      </w:pPr>
+      <w:r>
         <w:t>These five habits don’t require time, money, or planning. They require intention. Do them every day for two weeks, and you’ll feel the difference. Do them for thirty days, and you’ll start seeing yourself differently. Do them for ninety days, and they become part of who you are.</w:t>
       </w:r>
     </w:p>
     <w:p>
       <w:pPr>
         <w:rPr>
-          <w:lang w:val="en-IL"/>
-        </w:rPr>
-      </w:pPr>
-      <w:r>
-        <w:rPr>
-          <w:lang w:val="en-IL"/>
-        </w:rPr>
+          <w:lang w:val="en-US"/>
+        </w:rPr>
+      </w:pPr>
+      <w:hyperlink r:id="rId5" w:history="1">
+        <w:r>
+          <w:rPr>
+            <w:rStyle w:val="Hyperlink"/>
+            <w:lang w:val="en-US"/>
+          </w:rPr>
+          <w:t>https://jsonformatter.curiousconcept.com/#</w:t>
+        </w:r>
+      </w:hyperlink>
+    </w:p>
+    <w:p>
+      <w:r>
         <w:t>When happiness becomes a practice, it becomes a lifestyle.</w:t>
       </w:r>
     </w:p>
-    <w:p>
-      <w:pPr>
-        <w:rPr>
-          <w:lang w:val="en-IL"/>
-        </w:rPr>
-      </w:pPr>
-    </w:p>
+    <w:p/>
     <w:sectPr>
       <w:pgSz w:w="11906" w:h="16838"/>
       <w:pgMar w:top="1440" w:right="1440" w:bottom="1440" w:left="1440" w:header="708" w:footer="708" w:gutter="0"/>
@@ -1609,7 +978,7 @@
 </file>
 
 <file path=word/numbering.xml><?xml version="1.0" encoding="utf-8"?>
-<w:numbering xmlns:wpc="http://schemas.microsoft.com/office/word/2010/wordprocessingCanvas" xmlns:cx="http://schemas.microsoft.com/office/drawing/2014/chartex" xmlns:cx1="http://schemas.microsoft.com/office/drawing/2015/9/8/chartex" xmlns:cx2="http://schemas.microsoft.com/office/drawing/2015/10/21/chartex" xmlns:cx3="http://schemas.microsoft.com/office/drawing/2016/5/9/chartex" xmlns:cx4="http://schemas.microsoft.com/office/drawing/2016/5/10/chartex" xmlns:cx5="http://schemas.microsoft.com/office/drawing/2016/5/11/chartex" xmlns:cx6="http://schemas.microsoft.com/office/drawing/2016/5/12/chartex" xmlns:cx7="http://schemas.microsoft.com/office/drawing/2016/5/13/chartex" xmlns:cx8="http://schemas.microsoft.com/office/drawing/2016/5/14/chartex" xmlns:mc="http://schemas.openxmlformats.org/markup-compatibility/2006" xmlns:aink="http://schemas.microsoft.com/office/drawing/2016/ink" xmlns:am3d="http://schemas.microsoft.com/office/drawing/2017/model3d" xmlns:o="urn:schemas-microsoft-com:office:office" xmlns:oel="http://schemas.microsoft.com/office/2019/extlst" xmlns:r="http://schemas.openxmlformats.org/officeDocument/2006/relationships" xmlns:m="http://schemas.openxmlformats.org/officeDocument/2006/math" xmlns:v="urn:schemas-microsoft-com:vml" xmlns:wp14="http://schemas.microsoft.com/office/word/2010/wordprocessingDrawing" xmlns:wp="http://schemas.openxmlformats.org/drawingml/2006/wordprocessingDrawing" xmlns:w10="urn:schemas-microsoft-com:office:word" xmlns:w="http://schemas.openxmlformats.org/wordprocessingml/2006/main" xmlns:w14="http://schemas.microsoft.com/office/word/2010/wordml" xmlns:w15="http://schemas.microsoft.com/office/word/2012/wordml" xmlns:w16cex="http://schemas.microsoft.com/office/word/2018/wordml/cex" xmlns:w16cid="http://schemas.microsoft.com/office/word/2016/wordml/cid" xmlns:w16="http://schemas.microsoft.com/office/word/2018/wordml" xmlns:w16sdtdh="http://schemas.microsoft.com/office/word/2020/wordml/sdtdatahash" xmlns:w16se="http://schemas.microsoft.com/office/word/2015/wordml/symex" xmlns:wpg="http://schemas.microsoft.com/office/word/2010/wordprocessingGroup" xmlns:wpi="http://schemas.microsoft.com/office/word/2010/wordprocessingInk" xmlns:wne="http://schemas.microsoft.com/office/word/2006/wordml" xmlns:wps="http://schemas.microsoft.com/office/word/2010/wordprocessingShape" mc:Ignorable="w14 w15 w16se w16cid w16 w16cex w16sdtdh wp14">
+<w:numbering xmlns:wpc="http://schemas.microsoft.com/office/word/2010/wordprocessingCanvas" xmlns:cx="http://schemas.microsoft.com/office/drawing/2014/chartex" xmlns:cx1="http://schemas.microsoft.com/office/drawing/2015/9/8/chartex" xmlns:cx2="http://schemas.microsoft.com/office/drawing/2015/10/21/chartex" xmlns:cx3="http://schemas.microsoft.com/office/drawing/2016/5/9/chartex" xmlns:cx4="http://schemas.microsoft.com/office/drawing/2016/5/10/chartex" xmlns:cx5="http://schemas.microsoft.com/office/drawing/2016/5/11/chartex" xmlns:cx6="http://schemas.microsoft.com/office/drawing/2016/5/12/chartex" xmlns:cx7="http://schemas.microsoft.com/office/drawing/2016/5/13/chartex" xmlns:cx8="http://schemas.microsoft.com/office/drawing/2016/5/14/chartex" xmlns:mc="http://schemas.openxmlformats.org/markup-compatibility/2006" xmlns:aink="http://schemas.microsoft.com/office/drawing/2016/ink" xmlns:am3d="http://schemas.microsoft.com/office/drawing/2017/model3d" xmlns:o="urn:schemas-microsoft-com:office:office" xmlns:oel="http://schemas.microsoft.com/office/2019/extlst" xmlns:r="http://schemas.openxmlformats.org/officeDocument/2006/relationships" xmlns:m="http://schemas.openxmlformats.org/officeDocument/2006/math" xmlns:v="urn:schemas-microsoft-com:vml" xmlns:wp14="http://schemas.microsoft.com/office/word/2010/wordprocessingDrawing" xmlns:wp="http://schemas.openxmlformats.org/drawingml/2006/wordprocessingDrawing" xmlns:w10="urn:schemas-microsoft-com:office:word" xmlns:w="http://schemas.openxmlformats.org/wordprocessingml/2006/main" xmlns:w14="http://schemas.microsoft.com/office/word/2010/wordml" xmlns:w15="http://schemas.microsoft.com/office/word/2012/wordml" xmlns:w16cex="http://schemas.microsoft.com/office/word/2018/wordml/cex" xmlns:w16cid="http://schemas.microsoft.com/office/word/2016/wordml/cid" xmlns:w16="http://schemas.microsoft.com/office/word/2018/wordml" xmlns:w16du="http://schemas.microsoft.com/office/word/2023/wordml/word16du" xmlns:w16sdtdh="http://schemas.microsoft.com/office/word/2020/wordml/sdtdatahash" xmlns:w16sdtfl="http://schemas.microsoft.com/office/word/2024/wordml/sdtformatlock" xmlns:w16se="http://schemas.microsoft.com/office/word/2015/wordml/symex" xmlns:wpg="http://schemas.microsoft.com/office/word/2010/wordprocessingGroup" xmlns:wpi="http://schemas.microsoft.com/office/word/2010/wordprocessingInk" xmlns:wne="http://schemas.microsoft.com/office/word/2006/wordml" xmlns:wps="http://schemas.microsoft.com/office/word/2010/wordprocessingShape" mc:Ignorable="w14 w15 w16se w16cid w16 w16cex w16sdtdh w16sdtfl w16du wp14">
   <w:abstractNum w:abstractNumId="0" w15:restartNumberingAfterBreak="0">
     <w:nsid w:val="302D788E"/>
     <w:multiLevelType w:val="multilevel"/>
@@ -2490,7 +1859,7 @@
 </file>
 
 <file path=word/styles.xml><?xml version="1.0" encoding="utf-8"?>
-<w:styles xmlns:mc="http://schemas.openxmlformats.org/markup-compatibility/2006" xmlns:r="http://schemas.openxmlformats.org/officeDocument/2006/relationships" xmlns:w="http://schemas.openxmlformats.org/wordprocessingml/2006/main" xmlns:w14="http://schemas.microsoft.com/office/word/2010/wordml" xmlns:w15="http://schemas.microsoft.com/office/word/2012/wordml" xmlns:w16cex="http://schemas.microsoft.com/office/word/2018/wordml/cex" xmlns:w16cid="http://schemas.microsoft.com/office/word/2016/wordml/cid" xmlns:w16="http://schemas.microsoft.com/office/word/2018/wordml" xmlns:w16sdtdh="http://schemas.microsoft.com/office/word/2020/wordml/sdtdatahash" xmlns:w16se="http://schemas.microsoft.com/office/word/2015/wordml/symex" mc:Ignorable="w14 w15 w16se w16cid w16 w16cex w16sdtdh">
+<w:styles xmlns:mc="http://schemas.openxmlformats.org/markup-compatibility/2006" xmlns:r="http://schemas.openxmlformats.org/officeDocument/2006/relationships" xmlns:w="http://schemas.openxmlformats.org/wordprocessingml/2006/main" xmlns:w14="http://schemas.microsoft.com/office/word/2010/wordml" xmlns:w15="http://schemas.microsoft.com/office/word/2012/wordml" xmlns:w16cex="http://schemas.microsoft.com/office/word/2018/wordml/cex" xmlns:w16cid="http://schemas.microsoft.com/office/word/2016/wordml/cid" xmlns:w16="http://schemas.microsoft.com/office/word/2018/wordml" xmlns:w16du="http://schemas.microsoft.com/office/word/2023/wordml/word16du" xmlns:w16sdtdh="http://schemas.microsoft.com/office/word/2020/wordml/sdtdatahash" xmlns:w16sdtfl="http://schemas.microsoft.com/office/word/2024/wordml/sdtformatlock" xmlns:w16se="http://schemas.microsoft.com/office/word/2015/wordml/symex" mc:Ignorable="w14 w15 w16se w16cid w16 w16cex w16sdtdh w16sdtfl w16du">
   <w:docDefaults>
     <w:rPrDefault>
       <w:rPr>
@@ -2498,7 +1867,7 @@
         <w:kern w:val="2"/>
         <w:sz w:val="24"/>
         <w:szCs w:val="24"/>
-        <w:lang w:val="en-IL" w:eastAsia="en-US" w:bidi="he-IL"/>
+        <w:lang w:eastAsia="en-US" w:bidi="he-IL"/>
         <w14:ligatures w14:val="standardContextual"/>
       </w:rPr>
     </w:rPrDefault>
@@ -2886,15 +2255,15 @@
     <w:lsdException w:name="Unresolved Mention" w:semiHidden="1" w:unhideWhenUsed="1"/>
     <w:lsdException w:name="Smart Link" w:semiHidden="1" w:unhideWhenUsed="1"/>
   </w:latentStyles>
-  <w:style w:type="paragraph" w:default="1" w:styleId="Normal">
+  <w:style w:type="paragraph" w:default="1" w:styleId="a">
     <w:name w:val="Normal"/>
     <w:qFormat/>
   </w:style>
-  <w:style w:type="paragraph" w:styleId="Heading1">
+  <w:style w:type="paragraph" w:styleId="1">
     <w:name w:val="heading 1"/>
-    <w:basedOn w:val="Normal"/>
-    <w:next w:val="Normal"/>
-    <w:link w:val="Heading1Char"/>
+    <w:basedOn w:val="a"/>
+    <w:next w:val="a"/>
+    <w:link w:val="10"/>
     <w:uiPriority w:val="9"/>
     <w:qFormat/>
     <w:rsid w:val="00F21247"/>
@@ -2911,11 +2280,11 @@
       <w:szCs w:val="40"/>
     </w:rPr>
   </w:style>
-  <w:style w:type="paragraph" w:styleId="Heading2">
+  <w:style w:type="paragraph" w:styleId="2">
     <w:name w:val="heading 2"/>
-    <w:basedOn w:val="Normal"/>
-    <w:next w:val="Normal"/>
-    <w:link w:val="Heading2Char"/>
+    <w:basedOn w:val="a"/>
+    <w:next w:val="a"/>
+    <w:link w:val="20"/>
     <w:uiPriority w:val="9"/>
     <w:semiHidden/>
     <w:unhideWhenUsed/>
@@ -2934,11 +2303,11 @@
       <w:szCs w:val="32"/>
     </w:rPr>
   </w:style>
-  <w:style w:type="paragraph" w:styleId="Heading3">
+  <w:style w:type="paragraph" w:styleId="3">
     <w:name w:val="heading 3"/>
-    <w:basedOn w:val="Normal"/>
-    <w:next w:val="Normal"/>
-    <w:link w:val="Heading3Char"/>
+    <w:basedOn w:val="a"/>
+    <w:next w:val="a"/>
+    <w:link w:val="30"/>
     <w:uiPriority w:val="9"/>
     <w:semiHidden/>
     <w:unhideWhenUsed/>
@@ -2957,11 +2326,11 @@
       <w:szCs w:val="28"/>
     </w:rPr>
   </w:style>
-  <w:style w:type="paragraph" w:styleId="Heading4">
+  <w:style w:type="paragraph" w:styleId="4">
     <w:name w:val="heading 4"/>
-    <w:basedOn w:val="Normal"/>
-    <w:next w:val="Normal"/>
-    <w:link w:val="Heading4Char"/>
+    <w:basedOn w:val="a"/>
+    <w:next w:val="a"/>
+    <w:link w:val="40"/>
     <w:uiPriority w:val="9"/>
     <w:semiHidden/>
     <w:unhideWhenUsed/>
@@ -2980,11 +2349,11 @@
       <w:color w:val="0F4761" w:themeColor="accent1" w:themeShade="BF"/>
     </w:rPr>
   </w:style>
-  <w:style w:type="paragraph" w:styleId="Heading5">
+  <w:style w:type="paragraph" w:styleId="5">
     <w:name w:val="heading 5"/>
-    <w:basedOn w:val="Normal"/>
-    <w:next w:val="Normal"/>
-    <w:link w:val="Heading5Char"/>
+    <w:basedOn w:val="a"/>
+    <w:next w:val="a"/>
+    <w:link w:val="50"/>
     <w:uiPriority w:val="9"/>
     <w:semiHidden/>
     <w:unhideWhenUsed/>
@@ -3001,11 +2370,11 @@
       <w:color w:val="0F4761" w:themeColor="accent1" w:themeShade="BF"/>
     </w:rPr>
   </w:style>
-  <w:style w:type="paragraph" w:styleId="Heading6">
+  <w:style w:type="paragraph" w:styleId="6">
     <w:name w:val="heading 6"/>
-    <w:basedOn w:val="Normal"/>
-    <w:next w:val="Normal"/>
-    <w:link w:val="Heading6Char"/>
+    <w:basedOn w:val="a"/>
+    <w:next w:val="a"/>
+    <w:link w:val="60"/>
     <w:uiPriority w:val="9"/>
     <w:semiHidden/>
     <w:unhideWhenUsed/>
@@ -3024,11 +2393,11 @@
       <w:color w:val="595959" w:themeColor="text1" w:themeTint="A6"/>
     </w:rPr>
   </w:style>
-  <w:style w:type="paragraph" w:styleId="Heading7">
+  <w:style w:type="paragraph" w:styleId="7">
     <w:name w:val="heading 7"/>
-    <w:basedOn w:val="Normal"/>
-    <w:next w:val="Normal"/>
-    <w:link w:val="Heading7Char"/>
+    <w:basedOn w:val="a"/>
+    <w:next w:val="a"/>
+    <w:link w:val="70"/>
     <w:uiPriority w:val="9"/>
     <w:semiHidden/>
     <w:unhideWhenUsed/>
@@ -3045,11 +2414,11 @@
       <w:color w:val="595959" w:themeColor="text1" w:themeTint="A6"/>
     </w:rPr>
   </w:style>
-  <w:style w:type="paragraph" w:styleId="Heading8">
+  <w:style w:type="paragraph" w:styleId="8">
     <w:name w:val="heading 8"/>
-    <w:basedOn w:val="Normal"/>
-    <w:next w:val="Normal"/>
-    <w:link w:val="Heading8Char"/>
+    <w:basedOn w:val="a"/>
+    <w:next w:val="a"/>
+    <w:link w:val="80"/>
     <w:uiPriority w:val="9"/>
     <w:semiHidden/>
     <w:unhideWhenUsed/>
@@ -3068,11 +2437,11 @@
       <w:color w:val="272727" w:themeColor="text1" w:themeTint="D8"/>
     </w:rPr>
   </w:style>
-  <w:style w:type="paragraph" w:styleId="Heading9">
+  <w:style w:type="paragraph" w:styleId="9">
     <w:name w:val="heading 9"/>
-    <w:basedOn w:val="Normal"/>
-    <w:next w:val="Normal"/>
-    <w:link w:val="Heading9Char"/>
+    <w:basedOn w:val="a"/>
+    <w:next w:val="a"/>
+    <w:link w:val="90"/>
     <w:uiPriority w:val="9"/>
     <w:semiHidden/>
     <w:unhideWhenUsed/>
@@ -3089,12 +2458,13 @@
       <w:color w:val="272727" w:themeColor="text1" w:themeTint="D8"/>
     </w:rPr>
   </w:style>
-  <w:style w:type="character" w:default="1" w:styleId="DefaultParagraphFont">
+  <w:style w:type="character" w:default="1" w:styleId="a0">
     <w:name w:val="Default Paragraph Font"/>
     <w:uiPriority w:val="1"/>
+    <w:semiHidden/>
     <w:unhideWhenUsed/>
   </w:style>
-  <w:style w:type="table" w:default="1" w:styleId="TableNormal">
+  <w:style w:type="table" w:default="1" w:styleId="a1">
     <w:name w:val="Normal Table"/>
     <w:uiPriority w:val="99"/>
     <w:semiHidden/>
@@ -3109,16 +2479,16 @@
       </w:tblCellMar>
     </w:tblPr>
   </w:style>
-  <w:style w:type="numbering" w:default="1" w:styleId="NoList">
+  <w:style w:type="numbering" w:default="1" w:styleId="a2">
     <w:name w:val="No List"/>
     <w:uiPriority w:val="99"/>
     <w:semiHidden/>
     <w:unhideWhenUsed/>
   </w:style>
-  <w:style w:type="character" w:customStyle="1" w:styleId="Heading1Char">
-    <w:name w:val="Heading 1 Char"/>
-    <w:basedOn w:val="DefaultParagraphFont"/>
-    <w:link w:val="Heading1"/>
+  <w:style w:type="character" w:customStyle="1" w:styleId="10">
+    <w:name w:val="כותרת 1 תו"/>
+    <w:basedOn w:val="a0"/>
+    <w:link w:val="1"/>
     <w:uiPriority w:val="9"/>
     <w:rsid w:val="00F21247"/>
     <w:rPr>
@@ -3128,10 +2498,10 @@
       <w:szCs w:val="40"/>
     </w:rPr>
   </w:style>
-  <w:style w:type="character" w:customStyle="1" w:styleId="Heading2Char">
-    <w:name w:val="Heading 2 Char"/>
-    <w:basedOn w:val="DefaultParagraphFont"/>
-    <w:link w:val="Heading2"/>
+  <w:style w:type="character" w:customStyle="1" w:styleId="20">
+    <w:name w:val="כותרת 2 תו"/>
+    <w:basedOn w:val="a0"/>
+    <w:link w:val="2"/>
     <w:uiPriority w:val="9"/>
     <w:semiHidden/>
     <w:rsid w:val="00F21247"/>
@@ -3142,10 +2512,10 @@
       <w:szCs w:val="32"/>
     </w:rPr>
   </w:style>
-  <w:style w:type="character" w:customStyle="1" w:styleId="Heading3Char">
-    <w:name w:val="Heading 3 Char"/>
-    <w:basedOn w:val="DefaultParagraphFont"/>
-    <w:link w:val="Heading3"/>
+  <w:style w:type="character" w:customStyle="1" w:styleId="30">
+    <w:name w:val="כותרת 3 תו"/>
+    <w:basedOn w:val="a0"/>
+    <w:link w:val="3"/>
     <w:uiPriority w:val="9"/>
     <w:semiHidden/>
     <w:rsid w:val="00F21247"/>
@@ -3156,10 +2526,10 @@
       <w:szCs w:val="28"/>
     </w:rPr>
   </w:style>
-  <w:style w:type="character" w:customStyle="1" w:styleId="Heading4Char">
-    <w:name w:val="Heading 4 Char"/>
-    <w:basedOn w:val="DefaultParagraphFont"/>
-    <w:link w:val="Heading4"/>
+  <w:style w:type="character" w:customStyle="1" w:styleId="40">
+    <w:name w:val="כותרת 4 תו"/>
+    <w:basedOn w:val="a0"/>
+    <w:link w:val="4"/>
     <w:uiPriority w:val="9"/>
     <w:semiHidden/>
     <w:rsid w:val="00F21247"/>
@@ -3170,10 +2540,10 @@
       <w:color w:val="0F4761" w:themeColor="accent1" w:themeShade="BF"/>
     </w:rPr>
   </w:style>
-  <w:style w:type="character" w:customStyle="1" w:styleId="Heading5Char">
-    <w:name w:val="Heading 5 Char"/>
-    <w:basedOn w:val="DefaultParagraphFont"/>
-    <w:link w:val="Heading5"/>
+  <w:style w:type="character" w:customStyle="1" w:styleId="50">
+    <w:name w:val="כותרת 5 תו"/>
+    <w:basedOn w:val="a0"/>
+    <w:link w:val="5"/>
     <w:uiPriority w:val="9"/>
     <w:semiHidden/>
     <w:rsid w:val="00F21247"/>
@@ -3182,10 +2552,10 @@
       <w:color w:val="0F4761" w:themeColor="accent1" w:themeShade="BF"/>
     </w:rPr>
   </w:style>
-  <w:style w:type="character" w:customStyle="1" w:styleId="Heading6Char">
-    <w:name w:val="Heading 6 Char"/>
-    <w:basedOn w:val="DefaultParagraphFont"/>
-    <w:link w:val="Heading6"/>
+  <w:style w:type="character" w:customStyle="1" w:styleId="60">
+    <w:name w:val="כותרת 6 תו"/>
+    <w:basedOn w:val="a0"/>
+    <w:link w:val="6"/>
     <w:uiPriority w:val="9"/>
     <w:semiHidden/>
     <w:rsid w:val="00F21247"/>
@@ -3196,10 +2566,10 @@
       <w:color w:val="595959" w:themeColor="text1" w:themeTint="A6"/>
     </w:rPr>
   </w:style>
-  <w:style w:type="character" w:customStyle="1" w:styleId="Heading7Char">
-    <w:name w:val="Heading 7 Char"/>
-    <w:basedOn w:val="DefaultParagraphFont"/>
-    <w:link w:val="Heading7"/>
+  <w:style w:type="character" w:customStyle="1" w:styleId="70">
+    <w:name w:val="כותרת 7 תו"/>
+    <w:basedOn w:val="a0"/>
+    <w:link w:val="7"/>
     <w:uiPriority w:val="9"/>
     <w:semiHidden/>
     <w:rsid w:val="00F21247"/>
@@ -3208,10 +2578,10 @@
       <w:color w:val="595959" w:themeColor="text1" w:themeTint="A6"/>
     </w:rPr>
   </w:style>
-  <w:style w:type="character" w:customStyle="1" w:styleId="Heading8Char">
-    <w:name w:val="Heading 8 Char"/>
-    <w:basedOn w:val="DefaultParagraphFont"/>
-    <w:link w:val="Heading8"/>
+  <w:style w:type="character" w:customStyle="1" w:styleId="80">
+    <w:name w:val="כותרת 8 תו"/>
+    <w:basedOn w:val="a0"/>
+    <w:link w:val="8"/>
     <w:uiPriority w:val="9"/>
     <w:semiHidden/>
     <w:rsid w:val="00F21247"/>
@@ -3222,10 +2592,10 @@
       <w:color w:val="272727" w:themeColor="text1" w:themeTint="D8"/>
     </w:rPr>
   </w:style>
-  <w:style w:type="character" w:customStyle="1" w:styleId="Heading9Char">
-    <w:name w:val="Heading 9 Char"/>
-    <w:basedOn w:val="DefaultParagraphFont"/>
-    <w:link w:val="Heading9"/>
+  <w:style w:type="character" w:customStyle="1" w:styleId="90">
+    <w:name w:val="כותרת 9 תו"/>
+    <w:basedOn w:val="a0"/>
+    <w:link w:val="9"/>
     <w:uiPriority w:val="9"/>
     <w:semiHidden/>
     <w:rsid w:val="00F21247"/>
@@ -3234,11 +2604,11 @@
       <w:color w:val="272727" w:themeColor="text1" w:themeTint="D8"/>
     </w:rPr>
   </w:style>
-  <w:style w:type="paragraph" w:styleId="Title">
+  <w:style w:type="paragraph" w:styleId="a3">
     <w:name w:val="Title"/>
-    <w:basedOn w:val="Normal"/>
-    <w:next w:val="Normal"/>
-    <w:link w:val="TitleChar"/>
+    <w:basedOn w:val="a"/>
+    <w:next w:val="a"/>
+    <w:link w:val="a4"/>
     <w:uiPriority w:val="10"/>
     <w:qFormat/>
     <w:rsid w:val="00F21247"/>
@@ -3254,10 +2624,10 @@
       <w:szCs w:val="56"/>
     </w:rPr>
   </w:style>
-  <w:style w:type="character" w:customStyle="1" w:styleId="TitleChar">
-    <w:name w:val="Title Char"/>
-    <w:basedOn w:val="DefaultParagraphFont"/>
-    <w:link w:val="Title"/>
+  <w:style w:type="character" w:customStyle="1" w:styleId="a4">
+    <w:name w:val="כותרת טקסט תו"/>
+    <w:basedOn w:val="a0"/>
+    <w:link w:val="a3"/>
     <w:uiPriority w:val="10"/>
     <w:rsid w:val="00F21247"/>
     <w:rPr>
@@ -3268,11 +2638,11 @@
       <w:szCs w:val="56"/>
     </w:rPr>
   </w:style>
-  <w:style w:type="paragraph" w:styleId="Subtitle">
+  <w:style w:type="paragraph" w:styleId="a5">
     <w:name w:val="Subtitle"/>
-    <w:basedOn w:val="Normal"/>
-    <w:next w:val="Normal"/>
-    <w:link w:val="SubtitleChar"/>
+    <w:basedOn w:val="a"/>
+    <w:next w:val="a"/>
+    <w:link w:val="a6"/>
     <w:uiPriority w:val="11"/>
     <w:qFormat/>
     <w:rsid w:val="00F21247"/>
@@ -3289,10 +2659,10 @@
       <w:szCs w:val="28"/>
     </w:rPr>
   </w:style>
-  <w:style w:type="character" w:customStyle="1" w:styleId="SubtitleChar">
-    <w:name w:val="Subtitle Char"/>
-    <w:basedOn w:val="DefaultParagraphFont"/>
-    <w:link w:val="Subtitle"/>
+  <w:style w:type="character" w:customStyle="1" w:styleId="a6">
+    <w:name w:val="כותרת משנה תו"/>
+    <w:basedOn w:val="a0"/>
+    <w:link w:val="a5"/>
     <w:uiPriority w:val="11"/>
     <w:rsid w:val="00F21247"/>
     <w:rPr>
@@ -3303,11 +2673,11 @@
       <w:szCs w:val="28"/>
     </w:rPr>
   </w:style>
-  <w:style w:type="paragraph" w:styleId="Quote">
+  <w:style w:type="paragraph" w:styleId="a7">
     <w:name w:val="Quote"/>
-    <w:basedOn w:val="Normal"/>
-    <w:next w:val="Normal"/>
-    <w:link w:val="QuoteChar"/>
+    <w:basedOn w:val="a"/>
+    <w:next w:val="a"/>
+    <w:link w:val="a8"/>
     <w:uiPriority w:val="29"/>
     <w:qFormat/>
     <w:rsid w:val="00F21247"/>
@@ -3321,10 +2691,10 @@
       <w:color w:val="404040" w:themeColor="text1" w:themeTint="BF"/>
     </w:rPr>
   </w:style>
-  <w:style w:type="character" w:customStyle="1" w:styleId="QuoteChar">
-    <w:name w:val="Quote Char"/>
-    <w:basedOn w:val="DefaultParagraphFont"/>
-    <w:link w:val="Quote"/>
+  <w:style w:type="character" w:customStyle="1" w:styleId="a8">
+    <w:name w:val="ציטוט תו"/>
+    <w:basedOn w:val="a0"/>
+    <w:link w:val="a7"/>
     <w:uiPriority w:val="29"/>
     <w:rsid w:val="00F21247"/>
     <w:rPr>
@@ -3333,9 +2703,9 @@
       <w:color w:val="404040" w:themeColor="text1" w:themeTint="BF"/>
     </w:rPr>
   </w:style>
-  <w:style w:type="paragraph" w:styleId="ListParagraph">
+  <w:style w:type="paragraph" w:styleId="a9">
     <w:name w:val="List Paragraph"/>
-    <w:basedOn w:val="Normal"/>
+    <w:basedOn w:val="a"/>
     <w:uiPriority w:val="34"/>
     <w:qFormat/>
     <w:rsid w:val="00F21247"/>
@@ -3344,9 +2714,9 @@
       <w:contextualSpacing/>
     </w:pPr>
   </w:style>
-  <w:style w:type="character" w:styleId="IntenseEmphasis">
+  <w:style w:type="character" w:styleId="aa">
     <w:name w:val="Intense Emphasis"/>
-    <w:basedOn w:val="DefaultParagraphFont"/>
+    <w:basedOn w:val="a0"/>
     <w:uiPriority w:val="21"/>
     <w:qFormat/>
     <w:rsid w:val="00F21247"/>
@@ -3356,11 +2726,11 @@
       <w:color w:val="0F4761" w:themeColor="accent1" w:themeShade="BF"/>
     </w:rPr>
   </w:style>
-  <w:style w:type="paragraph" w:styleId="IntenseQuote">
+  <w:style w:type="paragraph" w:styleId="ab">
     <w:name w:val="Intense Quote"/>
-    <w:basedOn w:val="Normal"/>
-    <w:next w:val="Normal"/>
-    <w:link w:val="IntenseQuoteChar"/>
+    <w:basedOn w:val="a"/>
+    <w:next w:val="a"/>
+    <w:link w:val="ac"/>
     <w:uiPriority w:val="30"/>
     <w:qFormat/>
     <w:rsid w:val="00F21247"/>
@@ -3379,10 +2749,10 @@
       <w:color w:val="0F4761" w:themeColor="accent1" w:themeShade="BF"/>
     </w:rPr>
   </w:style>
-  <w:style w:type="character" w:customStyle="1" w:styleId="IntenseQuoteChar">
-    <w:name w:val="Intense Quote Char"/>
-    <w:basedOn w:val="DefaultParagraphFont"/>
-    <w:link w:val="IntenseQuote"/>
+  <w:style w:type="character" w:customStyle="1" w:styleId="ac">
+    <w:name w:val="ציטוט חזק תו"/>
+    <w:basedOn w:val="a0"/>
+    <w:link w:val="ab"/>
     <w:uiPriority w:val="30"/>
     <w:rsid w:val="00F21247"/>
     <w:rPr>
@@ -3391,9 +2761,9 @@
       <w:color w:val="0F4761" w:themeColor="accent1" w:themeShade="BF"/>
     </w:rPr>
   </w:style>
-  <w:style w:type="character" w:styleId="IntenseReference">
+  <w:style w:type="character" w:styleId="ad">
     <w:name w:val="Intense Reference"/>
-    <w:basedOn w:val="DefaultParagraphFont"/>
+    <w:basedOn w:val="a0"/>
     <w:uiPriority w:val="32"/>
     <w:qFormat/>
     <w:rsid w:val="00F21247"/>
@@ -3403,6 +2773,29 @@
       <w:smallCaps/>
       <w:color w:val="0F4761" w:themeColor="accent1" w:themeShade="BF"/>
       <w:spacing w:val="5"/>
+    </w:rPr>
+  </w:style>
+  <w:style w:type="character" w:styleId="Hyperlink">
+    <w:name w:val="Hyperlink"/>
+    <w:basedOn w:val="a0"/>
+    <w:uiPriority w:val="99"/>
+    <w:unhideWhenUsed/>
+    <w:rsid w:val="00C47CA3"/>
+    <w:rPr>
+      <w:color w:val="467886" w:themeColor="hyperlink"/>
+      <w:u w:val="single"/>
+    </w:rPr>
+  </w:style>
+  <w:style w:type="character" w:styleId="ae">
+    <w:name w:val="Unresolved Mention"/>
+    <w:basedOn w:val="a0"/>
+    <w:uiPriority w:val="99"/>
+    <w:semiHidden/>
+    <w:unhideWhenUsed/>
+    <w:rsid w:val="00C47CA3"/>
+    <w:rPr>
+      <w:color w:val="605E5C"/>
+      <w:shd w:val="clear" w:color="auto" w:fill="E1DFDD"/>
     </w:rPr>
   </w:style>
 </w:styles>

</xml_diff>